<commit_message>
Add new media model fields and update review model
- Introduced new fields in the media model: `category`, `external_id`, and `title`, replacing the old `categoria` and `titulo` fields.
- Added new fields to the media model: `image_url`, `release_date`, and `synopsis`.
- Created a new detail template for media displaying image, title, category, release date, synopsis, and community rating.
- Renamed fields in the review model: `conteudo` to `content` and `recomendado` to `recommended`.
- Updated the review model to include a foreign key for `author` and a new boolean field `is_approved`.
</commit_message>
<xml_diff>
--- a/docs/caso_de_uso/Casos de Uso Criação de Review (OmniReviewer).docx
+++ b/docs/caso_de_uso/Casos de Uso Criação de Review (OmniReviewer).docx
@@ -179,15 +179,7 @@
       </w:r>
       <w:r>
         <w:rPr/>
-        <w:t xml:space="preserve">: RF: </w:t>
-      </w:r>
-      <w:r>
-        <w:rPr/>
-        <w:t>003,</w:t>
-      </w:r>
-      <w:r>
-        <w:rPr/>
-        <w:t xml:space="preserve"> 010</w:t>
+        <w:t>: RF: 003, 010</w:t>
       </w:r>
     </w:p>
     <w:p>
@@ -298,7 +290,6 @@
               <w:keepNext w:val="false"/>
               <w:keepLines w:val="false"/>
               <w:widowControl w:val="false"/>
-              <w:pBdr/>
               <w:shd w:val="clear" w:fill="auto"/>
               <w:spacing w:lineRule="auto" w:line="240" w:before="0" w:after="0"/>
               <w:ind w:hanging="0" w:start="0" w:end="0"/>
@@ -345,7 +336,15 @@
             </w:r>
             <w:r>
               <w:rPr/>
-              <w:t>o usuário clica no botão de criar review localizado na página principal da mídia.</w:t>
+              <w:t xml:space="preserve">o usuário clica no botão de criar review localizado na página </w:t>
+            </w:r>
+            <w:r>
+              <w:rPr/>
+              <w:t>de detalhes</w:t>
+            </w:r>
+            <w:r>
+              <w:rPr/>
+              <w:t xml:space="preserve"> da mídia.</w:t>
             </w:r>
           </w:p>
         </w:tc>
@@ -366,7 +365,6 @@
               <w:keepNext w:val="false"/>
               <w:keepLines w:val="false"/>
               <w:widowControl w:val="false"/>
-              <w:pBdr/>
               <w:shd w:val="clear" w:fill="auto"/>
               <w:spacing w:lineRule="auto" w:line="240" w:before="0" w:after="0"/>
               <w:ind w:hanging="0" w:start="0" w:end="0"/>
@@ -415,7 +413,6 @@
               <w:keepNext w:val="false"/>
               <w:keepLines w:val="false"/>
               <w:widowControl w:val="false"/>
-              <w:pBdr/>
               <w:shd w:val="clear" w:fill="auto"/>
               <w:spacing w:lineRule="auto" w:line="240" w:before="0" w:after="0"/>
               <w:ind w:hanging="0" w:start="0" w:end="0"/>
@@ -462,7 +459,6 @@
               <w:keepNext w:val="false"/>
               <w:keepLines w:val="false"/>
               <w:widowControl w:val="false"/>
-              <w:pBdr/>
               <w:shd w:val="clear" w:fill="auto"/>
               <w:spacing w:lineRule="auto" w:line="240" w:before="0" w:after="0"/>
               <w:ind w:hanging="0" w:start="0" w:end="0"/>
@@ -596,6 +592,7 @@
     <w:qFormat/>
     <w:pPr>
       <w:widowControl w:val="false"/>
+      <w:suppressAutoHyphens w:val="true"/>
       <w:bidi w:val="0"/>
       <w:spacing w:before="0" w:after="0"/>
       <w:jc w:val="start"/>
@@ -780,6 +777,7 @@
     <w:qFormat/>
     <w:pPr>
       <w:widowControl w:val="false"/>
+      <w:suppressAutoHyphens w:val="true"/>
       <w:bidi w:val="0"/>
       <w:spacing w:before="0" w:after="0"/>
       <w:jc w:val="start"/>

</xml_diff>